<commit_message>
Add data/table/visual additions to risk lecture doc
Agent-Logs-Url: https://github.com/2020Vignesh/YSP-TF/sessions/7597cad8-3631-44a3-b576-f3e7b35d2b12

Co-authored-by: 2020Vignesh <63853135+2020Vignesh@users.noreply.github.com>
</commit_message>
<xml_diff>
--- a/Risk_Lecture_Outline_and_Sources (2).docx
+++ b/Risk_Lecture_Outline_and_Sources (2).docx
@@ -636,6 +636,12 @@
       </w:r>
     </w:p>
     <w:p>
+      <w:pPr/>
+      <w:r>
+        <w:t>Add one line: “Optional empirical hook: long-run sovereign default frequency to show risk is persistent, not exceptional.”</w:t>
+      </w:r>
+    </w:p>
+    <w:p>
       <w:pPr>
         <w:spacing w:after="80" w:before="180" w:lineRule="auto"/>
         <w:rPr/>
@@ -762,6 +768,12 @@
       </w:r>
     </w:p>
     <w:p>
+      <w:pPr/>
+      <w:r>
+        <w:t>Add a small 2×2 table titled “Risk vs Uncertainty.”</w:t>
+      </w:r>
+    </w:p>
+    <w:p>
       <w:pPr>
         <w:spacing w:after="80" w:before="180" w:lineRule="auto"/>
         <w:rPr/>
@@ -867,6 +879,12 @@
       </w:r>
     </w:p>
     <w:p>
+      <w:pPr/>
+      <w:r>
+        <w:t>Add one note identifying these as optional opening visuals.</w:t>
+      </w:r>
+    </w:p>
+    <w:p>
       <w:pPr>
         <w:spacing w:after="80" w:before="180" w:lineRule="auto"/>
         <w:rPr/>
@@ -1562,6 +1580,30 @@
       </w:r>
     </w:p>
     <w:p>
+      <w:pPr/>
+      <w:r>
+        <w:t>Add a compact 2021–2022 comparison table for cyber-crime cases and fraud share.</w:t>
+      </w:r>
+    </w:p>
+    <w:p>
+      <w:pPr/>
+      <w:r>
+        <w:t>Add one bullet with the 51% increase statistic.</w:t>
+      </w:r>
+    </w:p>
+    <w:p>
+      <w:pPr/>
+      <w:r>
+        <w:t>Add a boxed case-study note titled “AIIMS Delhi, Nov 2022.”</w:t>
+      </w:r>
+    </w:p>
+    <w:p>
+      <w:pPr/>
+      <w:r>
+        <w:t>Add a line directing you to the “Frauds reported by banks — category-wise” table.</w:t>
+      </w:r>
+    </w:p>
+    <w:p>
       <w:pPr>
         <w:spacing w:after="80" w:before="180" w:lineRule="auto"/>
         <w:rPr/>
@@ -2018,6 +2060,24 @@
       </w:r>
     </w:p>
     <w:p>
+      <w:pPr/>
+      <w:r>
+        <w:t>Add a three-point forecast revision line: Jan 2020, Apr 2020, June 2020.</w:t>
+      </w:r>
+    </w:p>
+    <w:p>
+      <w:pPr/>
+      <w:r>
+        <w:t>Add the FY21 real GDP contraction as the outcome line.</w:t>
+      </w:r>
+    </w:p>
+    <w:p>
+      <w:pPr/>
+      <w:r>
+        <w:t>Add a note connecting crisis shock to reserve accumulation.</w:t>
+      </w:r>
+    </w:p>
+    <w:p>
       <w:pPr>
         <w:spacing w:after="80" w:before="180" w:lineRule="auto"/>
         <w:rPr/>
@@ -2495,6 +2555,18 @@
       </w:r>
     </w:p>
     <w:p>
+      <w:pPr/>
+      <w:r>
+        <w:t>Add the insured-loss statistic with a note that it was the largest man-made insured event at the time.</w:t>
+      </w:r>
+    </w:p>
+    <w:p>
+      <w:pPr/>
+      <w:r>
+        <w:t>Add one sentence on money-market stress and Fed facilities.</w:t>
+      </w:r>
+    </w:p>
+    <w:p>
       <w:pPr>
         <w:spacing w:after="80" w:before="180" w:lineRule="auto"/>
         <w:rPr/>
@@ -2867,6 +2939,30 @@
       </w:r>
     </w:p>
     <w:p>
+      <w:pPr/>
+      <w:r>
+        <w:t>Add a two-number climate risk fact box.</w:t>
+      </w:r>
+    </w:p>
+    <w:p>
+      <w:pPr/>
+      <w:r>
+        <w:t>Add a placeholder line to retrieve annual disaster-loss series.</w:t>
+      </w:r>
+    </w:p>
+    <w:p>
+      <w:pPr/>
+      <w:r>
+        <w:t>Add the 2030 labour-hour loss estimate.</w:t>
+      </w:r>
+    </w:p>
+    <w:p>
+      <w:pPr/>
+      <w:r>
+        <w:t>Add a mini case box on Chennai floods.</w:t>
+      </w:r>
+    </w:p>
+    <w:p>
       <w:pPr>
         <w:spacing w:after="80" w:before="180" w:lineRule="auto"/>
         <w:rPr/>
@@ -3035,6 +3131,12 @@
       </w:r>
     </w:p>
     <w:p>
+      <w:pPr/>
+      <w:r>
+        <w:t>Add a ranked state table under the segment.</w:t>
+      </w:r>
+    </w:p>
+    <w:p>
       <w:pPr>
         <w:spacing w:after="80" w:before="180" w:lineRule="auto"/>
         <w:rPr/>
@@ -3778,6 +3880,36 @@
       </w:r>
     </w:p>
     <w:p>
+      <w:pPr/>
+      <w:r>
+        <w:t>Add a small India-vs-world comparison table.</w:t>
+      </w:r>
+    </w:p>
+    <w:p>
+      <w:pPr/>
+      <w:r>
+        <w:t>Add as secondary industry-health bullet.</w:t>
+      </w:r>
+    </w:p>
+    <w:p>
+      <w:pPr/>
+      <w:r>
+        <w:t>Add “global context” source note.</w:t>
+      </w:r>
+    </w:p>
+    <w:p>
+      <w:pPr/>
+      <w:r>
+        <w:t>Add a state-wise PM-JAY extraction note.</w:t>
+      </w:r>
+    </w:p>
+    <w:p>
+      <w:pPr/>
+      <w:r>
+        <w:t>Add a “what remains uninsured?” data bullet on household balance sheets.</w:t>
+      </w:r>
+    </w:p>
+    <w:p>
       <w:pPr>
         <w:spacing w:after="80" w:before="180" w:lineRule="auto"/>
         <w:rPr/>
@@ -4072,6 +4204,12 @@
       </w:r>
     </w:p>
     <w:p>
+      <w:pPr/>
+      <w:r>
+        <w:t>Add exact table reference below the segment.</w:t>
+      </w:r>
+    </w:p>
+    <w:p>
       <w:pPr>
         <w:spacing w:after="80" w:before="180" w:lineRule="auto"/>
         <w:rPr/>
@@ -4899,6 +5037,36 @@
       </w:r>
     </w:p>
     <w:p>
+      <w:pPr/>
+      <w:r>
+        <w:t>Add one size-of-market bullet to show scale of risk transfer.</w:t>
+      </w:r>
+    </w:p>
+    <w:p>
+      <w:pPr/>
+      <w:r>
+        <w:t>Add a pre- and post-crisis CDS comparison bullet.</w:t>
+      </w:r>
+    </w:p>
+    <w:p>
+      <w:pPr/>
+      <w:r>
+        <w:t>Add corporate-bond-market size as domestic context.</w:t>
+      </w:r>
+    </w:p>
+    <w:p>
+      <w:pPr/>
+      <w:r>
+        <w:t>Add IL&amp;FS case box.</w:t>
+      </w:r>
+    </w:p>
+    <w:p>
+      <w:pPr/>
+      <w:r>
+        <w:t>Add Yes Bank case box with two numbers.</w:t>
+      </w:r>
+    </w:p>
+    <w:p>
       <w:pPr>
         <w:spacing w:after="80" w:before="180" w:lineRule="auto"/>
         <w:rPr/>
@@ -5151,6 +5319,12 @@
       </w:r>
     </w:p>
     <w:p>
+      <w:pPr/>
+      <w:r>
+        <w:t>Add one table on bond issuance structure and one on NBFC stress.</w:t>
+      </w:r>
+    </w:p>
+    <w:p>
       <w:pPr>
         <w:spacing w:after="80" w:before="180" w:lineRule="auto"/>
         <w:rPr/>
@@ -6161,6 +6335,24 @@
       </w:r>
     </w:p>
     <w:p>
+      <w:pPr/>
+      <w:r>
+        <w:t>Add one historical-statistic bullet.</w:t>
+      </w:r>
+    </w:p>
+    <w:p>
+      <w:pPr/>
+      <w:r>
+        <w:t>Add latest monsoon comparison line.</w:t>
+      </w:r>
+    </w:p>
+    <w:p>
+      <w:pPr/>
+      <w:r>
+        <w:t>Add a two-column “employment vs output” contrast.</w:t>
+      </w:r>
+    </w:p>
+    <w:p>
       <w:pPr>
         <w:spacing w:after="80" w:before="180" w:lineRule="auto"/>
         <w:rPr/>
@@ -6329,6 +6521,12 @@
       </w:r>
     </w:p>
     <w:p>
+      <w:pPr/>
+      <w:r>
+        <w:t>Add retrieval note for 1901–latest annual series.</w:t>
+      </w:r>
+    </w:p>
+    <w:p>
       <w:pPr>
         <w:spacing w:after="80" w:before="180" w:lineRule="auto"/>
         <w:rPr/>
@@ -6617,6 +6815,18 @@
       </w:r>
     </w:p>
     <w:p>
+      <w:pPr/>
+      <w:r>
+        <w:t>Add legal-institutional one-liner under this segment.</w:t>
+      </w:r>
+    </w:p>
+    <w:p>
+      <w:pPr/>
+      <w:r>
+        <w:t>Add latest policy snapshot box.</w:t>
+      </w:r>
+    </w:p>
+    <w:p>
       <w:pPr>
         <w:spacing w:after="80" w:before="180" w:lineRule="auto"/>
         <w:rPr/>
@@ -6827,6 +7037,12 @@
       </w:r>
     </w:p>
     <w:p>
+      <w:pPr/>
+      <w:r>
+        <w:t>Add a simple glide-path table.</w:t>
+      </w:r>
+    </w:p>
+    <w:p>
       <w:pPr>
         <w:spacing w:after="80" w:before="180" w:lineRule="auto"/>
         <w:rPr/>
@@ -7262,6 +7478,18 @@
       </w:r>
     </w:p>
     <w:p>
+      <w:pPr/>
+      <w:r>
+        <w:t>Add a two-line “shock magnitude” fact box.</w:t>
+      </w:r>
+    </w:p>
+    <w:p>
+      <w:pPr/>
+      <w:r>
+        <w:t>Add the 2 percentage-point effect estimate with correct wording.</w:t>
+      </w:r>
+    </w:p>
+    <w:p>
       <w:pPr>
         <w:spacing w:after="80" w:before="180" w:lineRule="auto"/>
         <w:rPr/>
@@ -7430,6 +7658,12 @@
       </w:r>
     </w:p>
     <w:p>
+      <w:pPr/>
+      <w:r>
+        <w:t>Add exact table citation under the segment.</w:t>
+      </w:r>
+    </w:p>
+    <w:p>
       <w:pPr>
         <w:spacing w:after="80" w:before="180" w:lineRule="auto"/>
         <w:rPr/>
@@ -7535,6 +7769,12 @@
       </w:r>
     </w:p>
     <w:p>
+      <w:pPr/>
+      <w:r>
+        <w:t>Add as hook visuals only.</w:t>
+      </w:r>
+    </w:p>
+    <w:p>
       <w:pPr>
         <w:spacing w:after="80" w:before="180" w:lineRule="auto"/>
         <w:rPr/>
@@ -8677,6 +8917,24 @@
       </w:r>
     </w:p>
     <w:p>
+      <w:pPr/>
+      <w:r>
+        <w:t>Add a short time-series bullet for import dependence.</w:t>
+      </w:r>
+    </w:p>
+    <w:p>
+      <w:pPr/>
+      <w:r>
+        <w:t>Add the exact HBS table numbers directly under the segment.</w:t>
+      </w:r>
+    </w:p>
+    <w:p>
+      <w:pPr/>
+      <w:r>
+        <w:t>Add a 3-row sovereign-ratings table.</w:t>
+      </w:r>
+    </w:p>
+    <w:p>
       <w:pPr>
         <w:spacing w:after="80" w:before="180" w:lineRule="auto"/>
         <w:rPr/>
@@ -8929,6 +9187,12 @@
       </w:r>
     </w:p>
     <w:p>
+      <w:pPr/>
+      <w:r>
+        <w:t>Add one domestic time-series table and one current macro snapshot.</w:t>
+      </w:r>
+    </w:p>
+    <w:p>
       <w:pPr>
         <w:spacing w:after="80" w:before="180" w:lineRule="auto"/>
         <w:rPr/>
@@ -9728,6 +9992,30 @@
       </w:r>
     </w:p>
     <w:p>
+      <w:pPr/>
+      <w:r>
+        <w:t>Add a latest-number reserve snapshot.</w:t>
+      </w:r>
+    </w:p>
+    <w:p>
+      <w:pPr/>
+      <w:r>
+        <w:t>Add a note to reproduce the quarterly BoP table.</w:t>
+      </w:r>
+    </w:p>
+    <w:p>
+      <w:pPr/>
+      <w:r>
+        <w:t>Add one table for top investor countries.</w:t>
+      </w:r>
+    </w:p>
+    <w:p>
+      <w:pPr/>
+      <w:r>
+        <w:t>Add “India as top remittance recipient” statistic.</w:t>
+      </w:r>
+    </w:p>
+    <w:p>
       <w:pPr>
         <w:spacing w:after="80" w:before="180" w:lineRule="auto"/>
         <w:rPr/>
@@ -10561,6 +10849,24 @@
       </w:r>
     </w:p>
     <w:p>
+      <w:pPr/>
+      <w:r>
+        <w:t>Add a “crisis in one glance” fact box.</w:t>
+      </w:r>
+    </w:p>
+    <w:p>
+      <w:pPr/>
+      <w:r>
+        <w:t>Add a 3-line crisis chronology.</w:t>
+      </w:r>
+    </w:p>
+    <w:p>
+      <w:pPr/>
+      <w:r>
+        <w:t>Add a “why it happened” bullet list with fiscal and CAD numbers.</w:t>
+      </w:r>
+    </w:p>
+    <w:p>
       <w:pPr>
         <w:spacing w:after="80" w:before="180" w:lineRule="auto"/>
         <w:rPr/>
@@ -10729,6 +11035,12 @@
       </w:r>
     </w:p>
     <w:p>
+      <w:pPr/>
+      <w:r>
+        <w:t>Add exact table retrieval note.</w:t>
+      </w:r>
+    </w:p>
+    <w:p>
       <w:pPr>
         <w:spacing w:after="80" w:before="180" w:lineRule="auto"/>
         <w:rPr/>
@@ -11584,6 +11896,18 @@
       </w:r>
     </w:p>
     <w:p>
+      <w:pPr/>
+      <w:r>
+        <w:t>Add inflow and exchange-rate pair of numbers.</w:t>
+      </w:r>
+    </w:p>
+    <w:p>
+      <w:pPr/>
+      <w:r>
+        <w:t>Add one line explaining why MSS was introduced.</w:t>
+      </w:r>
+    </w:p>
+    <w:p>
       <w:pPr>
         <w:spacing w:after="80" w:before="180" w:lineRule="auto"/>
         <w:rPr/>
@@ -11836,6 +12160,12 @@
       </w:r>
     </w:p>
     <w:p>
+      <w:pPr/>
+      <w:r>
+        <w:t>Add references to both tables directly below the segment.</w:t>
+      </w:r>
+    </w:p>
+    <w:p>
       <w:pPr>
         <w:spacing w:after="80" w:before="180" w:lineRule="auto"/>
         <w:rPr/>
@@ -12439,6 +12769,24 @@
       </w:r>
     </w:p>
     <w:p>
+      <w:pPr/>
+      <w:r>
+        <w:t>Add macro-impact bullet.</w:t>
+      </w:r>
+    </w:p>
+    <w:p>
+      <w:pPr/>
+      <w:r>
+        <w:t>Add one quoted line for narration.</w:t>
+      </w:r>
+    </w:p>
+    <w:p>
+      <w:pPr/>
+      <w:r>
+        <w:t>Add as external shock evidence.</w:t>
+      </w:r>
+    </w:p>
+    <w:p>
       <w:pPr>
         <w:spacing w:after="80" w:before="180" w:lineRule="auto"/>
         <w:rPr/>
@@ -12649,6 +12997,12 @@
       </w:r>
     </w:p>
     <w:p>
+      <w:pPr/>
+      <w:r>
+        <w:t>Add policy-response table.</w:t>
+      </w:r>
+    </w:p>
+    <w:p>
       <w:pPr>
         <w:spacing w:after="80" w:before="180" w:lineRule="auto"/>
         <w:rPr/>
@@ -13444,6 +13798,18 @@
       </w:r>
     </w:p>
     <w:p>
+      <w:pPr/>
+      <w:r>
+        <w:t>Add three-number crisis summary.</w:t>
+      </w:r>
+    </w:p>
+    <w:p>
+      <w:pPr/>
+      <w:r>
+        <w:t>Add note that Eichengreen and Gupta is preferable for academic use.</w:t>
+      </w:r>
+    </w:p>
+    <w:p>
       <w:pPr>
         <w:spacing w:after="80" w:before="180" w:lineRule="auto"/>
         <w:rPr/>
@@ -13654,6 +14020,12 @@
       </w:r>
     </w:p>
     <w:p>
+      <w:pPr/>
+      <w:r>
+        <w:t>Add exact table reference.</w:t>
+      </w:r>
+    </w:p>
+    <w:p>
       <w:pPr>
         <w:spacing w:after="80" w:before="180" w:lineRule="auto"/>
         <w:rPr/>
@@ -14173,6 +14545,18 @@
       </w:r>
     </w:p>
     <w:p>
+      <w:pPr/>
+      <w:r>
+        <w:t>Add reserve-buildup timeline.</w:t>
+      </w:r>
+    </w:p>
+    <w:p>
+      <w:pPr/>
+      <w:r>
+        <w:t>Add one line on SDR allocation.</w:t>
+      </w:r>
+    </w:p>
+    <w:p>
       <w:pPr>
         <w:spacing w:after="80" w:before="180" w:lineRule="auto"/>
         <w:rPr/>
@@ -14860,6 +15244,24 @@
       </w:r>
     </w:p>
     <w:p>
+      <w:pPr/>
+      <w:r>
+        <w:t>Add a pre-war vs post-war import-share comparison.</w:t>
+      </w:r>
+    </w:p>
+    <w:p>
+      <w:pPr/>
+      <w:r>
+        <w:t>Add the discount statistic and export-destination line.</w:t>
+      </w:r>
+    </w:p>
+    <w:p>
+      <w:pPr/>
+      <w:r>
+        <w:t>Add one CAD-widening bullet.</w:t>
+      </w:r>
+    </w:p>
+    <w:p>
       <w:pPr>
         <w:spacing w:after="80" w:before="180" w:lineRule="auto"/>
         <w:rPr/>
@@ -15070,6 +15472,12 @@
       </w:r>
     </w:p>
     <w:p>
+      <w:pPr/>
+      <w:r>
+        <w:t>Add a 5-year import-source table.</w:t>
+      </w:r>
+    </w:p>
+    <w:p>
       <w:pPr>
         <w:spacing w:after="80" w:before="180" w:lineRule="auto"/>
         <w:rPr/>
@@ -15526,6 +15934,24 @@
       </w:r>
     </w:p>
     <w:p>
+      <w:pPr/>
+      <w:r>
+        <w:t>Add a “current macro dashboard” with 4–5 numbers.</w:t>
+      </w:r>
+    </w:p>
+    <w:p>
+      <w:pPr/>
+      <w:r>
+        <w:t>Add latest external-sector policy snapshot.</w:t>
+      </w:r>
+    </w:p>
+    <w:p>
+      <w:pPr/>
+      <w:r>
+        <w:t>Add a live-update line for May 2026 narration.</w:t>
+      </w:r>
+    </w:p>
+    <w:p>
       <w:pPr>
         <w:spacing w:after="80" w:before="180" w:lineRule="auto"/>
         <w:rPr/>
@@ -15736,6 +16162,12 @@
       </w:r>
     </w:p>
     <w:p>
+      <w:pPr/>
+      <w:r>
+        <w:t>Add one compact latest-indicator table.</w:t>
+      </w:r>
+    </w:p>
+    <w:p>
       <w:pPr>
         <w:spacing w:after="80" w:before="180" w:lineRule="auto"/>
         <w:rPr/>
@@ -16521,6 +16953,18 @@
       </w:r>
     </w:p>
     <w:p>
+      <w:pPr/>
+      <w:r>
+        <w:t>Add explicit reference to annual and monthly REER / NEER tables.</w:t>
+      </w:r>
+    </w:p>
+    <w:p>
+      <w:pPr/>
+      <w:r>
+        <w:t>Add one pass-through bullet with a range.</w:t>
+      </w:r>
+    </w:p>
+    <w:p>
       <w:pPr>
         <w:spacing w:after="80" w:before="180" w:lineRule="auto"/>
         <w:rPr/>
@@ -16731,6 +17175,12 @@
       </w:r>
     </w:p>
     <w:p>
+      <w:pPr/>
+      <w:r>
+        <w:t>Add a small summary table under the segment.</w:t>
+      </w:r>
+    </w:p>
+    <w:p>
       <w:pPr>
         <w:spacing w:after="80" w:before="180" w:lineRule="auto"/>
         <w:rPr/>
@@ -17369,6 +17819,24 @@
       </w:r>
     </w:p>
     <w:p>
+      <w:pPr/>
+      <w:r>
+        <w:t>Add exact WSS references for MSS and OMOs.</w:t>
+      </w:r>
+    </w:p>
+    <w:p>
+      <w:pPr/>
+      <w:r>
+        <w:t>Add CRR chronology note.</w:t>
+      </w:r>
+    </w:p>
+    <w:p>
+      <w:pPr/>
+      <w:r>
+        <w:t>Add one note pointing to India’s trilemma index series.</w:t>
+      </w:r>
+    </w:p>
+    <w:p>
       <w:pPr>
         <w:spacing w:after="80" w:before="180" w:lineRule="auto"/>
         <w:rPr/>
@@ -17618,6 +18086,12 @@
           <w:rtl w:val="0"/>
         </w:rPr>
         <w:t xml:space="preserve">RBI HBS Table 41 "Cash Reserve Ratio: A Profile" — CRR history. [Slide]</w:t>
+      </w:r>
+    </w:p>
+    <w:p>
+      <w:pPr/>
+      <w:r>
+        <w:t>Add a short operational-policy table.</w:t>
       </w:r>
     </w:p>
     <w:p>

</xml_diff>